<commit_message>
Implement forward() and include() methods
</commit_message>
<xml_diff>
--- a/JAVA_practical/Practical's.docx
+++ b/JAVA_practical/Practical's.docx
@@ -41494,7 +41494,8 @@
       </w:pPr>
       <w:r>
         <w:rPr>
-          <w:lang w:val="en-US"/>
+          <w:noProof/>
+          <w:lang w:eastAsia="en-IN"/>
         </w:rPr>
         <w:lastRenderedPageBreak/>
         <w:drawing>
@@ -42969,6 +42970,8 @@
         </w:rPr>
         <w:t>&gt;</w:t>
       </w:r>
+      <w:bookmarkStart w:id="0" w:name="_GoBack"/>
+      <w:bookmarkEnd w:id="0"/>
     </w:p>
     <w:p>
       <w:pPr>
@@ -52206,6 +52209,30 @@
     </w:p>
     <w:p>
       <w:pPr>
+        <w:spacing w:line="254" w:lineRule="auto"/>
+        <w:ind w:left="720"/>
+        <w:jc w:val="both"/>
+        <w:rPr>
+          <w:b/>
+          <w:bCs/>
+          <w:sz w:val="28"/>
+          <w:szCs w:val="28"/>
+          <w:lang w:val="en-US"/>
+        </w:rPr>
+      </w:pPr>
+      <w:r>
+        <w:rPr>
+          <w:b/>
+          <w:bCs/>
+          <w:sz w:val="28"/>
+          <w:szCs w:val="28"/>
+          <w:lang w:val="en-US"/>
+        </w:rPr>
+        <w:t>http://localhost:8080/ServletLifeCycle/lifecycle</w:t>
+      </w:r>
+    </w:p>
+    <w:p>
+      <w:pPr>
         <w:shd w:val="clear" w:color="auto" w:fill="FFFFFF"/>
         <w:spacing w:after="0" w:line="285" w:lineRule="atLeast"/>
         <w:rPr>
@@ -52226,6 +52253,273 @@
         </w:rPr>
         <w:tab/>
       </w:r>
+      <w:r>
+        <w:rPr>
+          <w:rFonts w:ascii="Consolas" w:eastAsia="Times New Roman" w:hAnsi="Consolas" w:cs="Times New Roman"/>
+          <w:color w:val="202020"/>
+          <w:sz w:val="21"/>
+          <w:szCs w:val="21"/>
+          <w:lang w:eastAsia="en-IN"/>
+        </w:rPr>
+        <w:t xml:space="preserve"> </w:t>
+      </w:r>
+      <w:r>
+        <w:rPr>
+          <w:rFonts w:ascii="Consolas" w:eastAsia="Times New Roman" w:hAnsi="Consolas" w:cs="Times New Roman"/>
+          <w:color w:val="202020"/>
+          <w:sz w:val="21"/>
+          <w:szCs w:val="21"/>
+          <w:lang w:eastAsia="en-IN"/>
+        </w:rPr>
+        <w:drawing>
+          <wp:inline distT="0" distB="0" distL="0" distR="0" wp14:anchorId="40725F66" wp14:editId="7EC2B194">
+            <wp:extent cx="3763108" cy="885438"/>
+            <wp:effectExtent l="19050" t="19050" r="8890" b="10160"/>
+            <wp:docPr id="463" name="Picture 463"/>
+            <wp:cNvGraphicFramePr>
+              <a:graphicFrameLocks xmlns:a="http://schemas.openxmlformats.org/drawingml/2006/main" noChangeAspect="1"/>
+            </wp:cNvGraphicFramePr>
+            <a:graphic xmlns:a="http://schemas.openxmlformats.org/drawingml/2006/main">
+              <a:graphicData uri="http://schemas.openxmlformats.org/drawingml/2006/picture">
+                <pic:pic xmlns:pic="http://schemas.openxmlformats.org/drawingml/2006/picture">
+                  <pic:nvPicPr>
+                    <pic:cNvPr id="0" name=""/>
+                    <pic:cNvPicPr/>
+                  </pic:nvPicPr>
+                  <pic:blipFill>
+                    <a:blip r:embed="rId111"/>
+                    <a:stretch>
+                      <a:fillRect/>
+                    </a:stretch>
+                  </pic:blipFill>
+                  <pic:spPr>
+                    <a:xfrm>
+                      <a:off x="0" y="0"/>
+                      <a:ext cx="3812513" cy="897063"/>
+                    </a:xfrm>
+                    <a:prstGeom prst="rect">
+                      <a:avLst/>
+                    </a:prstGeom>
+                    <a:ln>
+                      <a:solidFill>
+                        <a:schemeClr val="tx1"/>
+                      </a:solidFill>
+                    </a:ln>
+                  </pic:spPr>
+                </pic:pic>
+              </a:graphicData>
+            </a:graphic>
+          </wp:inline>
+        </w:drawing>
+      </w:r>
+    </w:p>
+    <w:p>
+      <w:pPr>
+        <w:shd w:val="clear" w:color="auto" w:fill="FFFFFF"/>
+        <w:spacing w:after="0" w:line="285" w:lineRule="atLeast"/>
+        <w:rPr>
+          <w:rFonts w:ascii="Consolas" w:eastAsia="Times New Roman" w:hAnsi="Consolas" w:cs="Times New Roman"/>
+          <w:color w:val="202020"/>
+          <w:sz w:val="21"/>
+          <w:szCs w:val="21"/>
+          <w:lang w:eastAsia="en-IN"/>
+        </w:rPr>
+      </w:pPr>
+      <w:r>
+        <w:rPr>
+          <w:rFonts w:ascii="Consolas" w:eastAsia="Times New Roman" w:hAnsi="Consolas" w:cs="Times New Roman"/>
+          <w:color w:val="202020"/>
+          <w:sz w:val="21"/>
+          <w:szCs w:val="21"/>
+          <w:lang w:eastAsia="en-IN"/>
+        </w:rPr>
+        <w:tab/>
+      </w:r>
+    </w:p>
+    <w:p>
+      <w:pPr>
+        <w:spacing w:line="254" w:lineRule="auto"/>
+        <w:ind w:left="720"/>
+        <w:jc w:val="both"/>
+        <w:rPr>
+          <w:b/>
+          <w:bCs/>
+          <w:sz w:val="28"/>
+          <w:szCs w:val="28"/>
+          <w:lang w:val="en-US"/>
+        </w:rPr>
+      </w:pPr>
+      <w:r>
+        <w:rPr>
+          <w:b/>
+          <w:bCs/>
+          <w:sz w:val="28"/>
+          <w:szCs w:val="28"/>
+          <w:lang w:val="en-US"/>
+        </w:rPr>
+        <w:t>http://localhost:8080/ServletLifeCycle/</w:t>
+      </w:r>
+    </w:p>
+    <w:p>
+      <w:pPr>
+        <w:spacing w:line="254" w:lineRule="auto"/>
+        <w:ind w:left="720"/>
+        <w:jc w:val="both"/>
+        <w:rPr>
+          <w:b/>
+          <w:bCs/>
+          <w:sz w:val="28"/>
+          <w:szCs w:val="28"/>
+          <w:lang w:val="en-US"/>
+        </w:rPr>
+      </w:pPr>
+      <w:r>
+        <w:rPr>
+          <w:noProof/>
+          <w:lang w:eastAsia="en-IN"/>
+        </w:rPr>
+        <w:drawing>
+          <wp:inline distT="0" distB="0" distL="0" distR="0" wp14:anchorId="3A05A0C2" wp14:editId="04F51024">
+            <wp:extent cx="1800000" cy="885714"/>
+            <wp:effectExtent l="19050" t="19050" r="10160" b="10160"/>
+            <wp:docPr id="464" name="Picture 464"/>
+            <wp:cNvGraphicFramePr>
+              <a:graphicFrameLocks xmlns:a="http://schemas.openxmlformats.org/drawingml/2006/main" noChangeAspect="1"/>
+            </wp:cNvGraphicFramePr>
+            <a:graphic xmlns:a="http://schemas.openxmlformats.org/drawingml/2006/main">
+              <a:graphicData uri="http://schemas.openxmlformats.org/drawingml/2006/picture">
+                <pic:pic xmlns:pic="http://schemas.openxmlformats.org/drawingml/2006/picture">
+                  <pic:nvPicPr>
+                    <pic:cNvPr id="0" name=""/>
+                    <pic:cNvPicPr/>
+                  </pic:nvPicPr>
+                  <pic:blipFill>
+                    <a:blip r:embed="rId112"/>
+                    <a:stretch>
+                      <a:fillRect/>
+                    </a:stretch>
+                  </pic:blipFill>
+                  <pic:spPr>
+                    <a:xfrm>
+                      <a:off x="0" y="0"/>
+                      <a:ext cx="1800000" cy="885714"/>
+                    </a:xfrm>
+                    <a:prstGeom prst="rect">
+                      <a:avLst/>
+                    </a:prstGeom>
+                    <a:ln>
+                      <a:solidFill>
+                        <a:schemeClr val="tx1"/>
+                      </a:solidFill>
+                    </a:ln>
+                  </pic:spPr>
+                </pic:pic>
+              </a:graphicData>
+            </a:graphic>
+          </wp:inline>
+        </w:drawing>
+      </w:r>
+    </w:p>
+    <w:p>
+      <w:pPr>
+        <w:spacing w:line="254" w:lineRule="auto"/>
+        <w:ind w:left="720"/>
+        <w:jc w:val="both"/>
+        <w:rPr>
+          <w:b/>
+          <w:bCs/>
+          <w:sz w:val="28"/>
+          <w:szCs w:val="28"/>
+          <w:lang w:val="en-US"/>
+        </w:rPr>
+      </w:pPr>
+      <w:r>
+        <w:rPr>
+          <w:b/>
+          <w:bCs/>
+          <w:sz w:val="28"/>
+          <w:szCs w:val="28"/>
+          <w:lang w:val="en-US"/>
+        </w:rPr>
+        <w:t>http://localhost:8080/ServletLifeCycle/hello-servlet</w:t>
+      </w:r>
+    </w:p>
+    <w:p>
+      <w:pPr>
+        <w:spacing w:line="254" w:lineRule="auto"/>
+        <w:ind w:left="720"/>
+        <w:jc w:val="both"/>
+        <w:rPr>
+          <w:b/>
+          <w:bCs/>
+          <w:sz w:val="28"/>
+          <w:szCs w:val="28"/>
+          <w:lang w:val="en-US"/>
+        </w:rPr>
+      </w:pPr>
+      <w:r>
+        <w:rPr>
+          <w:b/>
+          <w:bCs/>
+          <w:sz w:val="28"/>
+          <w:szCs w:val="28"/>
+          <w:lang w:val="en-US"/>
+        </w:rPr>
+        <w:drawing>
+          <wp:inline distT="0" distB="0" distL="0" distR="0" wp14:anchorId="62AA018C" wp14:editId="2F0A35F8">
+            <wp:extent cx="1800476" cy="400106"/>
+            <wp:effectExtent l="19050" t="19050" r="9525" b="19050"/>
+            <wp:docPr id="465" name="Picture 465"/>
+            <wp:cNvGraphicFramePr>
+              <a:graphicFrameLocks xmlns:a="http://schemas.openxmlformats.org/drawingml/2006/main" noChangeAspect="1"/>
+            </wp:cNvGraphicFramePr>
+            <a:graphic xmlns:a="http://schemas.openxmlformats.org/drawingml/2006/main">
+              <a:graphicData uri="http://schemas.openxmlformats.org/drawingml/2006/picture">
+                <pic:pic xmlns:pic="http://schemas.openxmlformats.org/drawingml/2006/picture">
+                  <pic:nvPicPr>
+                    <pic:cNvPr id="0" name=""/>
+                    <pic:cNvPicPr/>
+                  </pic:nvPicPr>
+                  <pic:blipFill>
+                    <a:blip r:embed="rId113"/>
+                    <a:stretch>
+                      <a:fillRect/>
+                    </a:stretch>
+                  </pic:blipFill>
+                  <pic:spPr>
+                    <a:xfrm>
+                      <a:off x="0" y="0"/>
+                      <a:ext cx="1800476" cy="400106"/>
+                    </a:xfrm>
+                    <a:prstGeom prst="rect">
+                      <a:avLst/>
+                    </a:prstGeom>
+                    <a:ln>
+                      <a:solidFill>
+                        <a:schemeClr val="tx1"/>
+                      </a:solidFill>
+                    </a:ln>
+                  </pic:spPr>
+                </pic:pic>
+              </a:graphicData>
+            </a:graphic>
+          </wp:inline>
+        </w:drawing>
+      </w:r>
+    </w:p>
+    <w:p>
+      <w:pPr>
+        <w:shd w:val="clear" w:color="auto" w:fill="FFFFFF"/>
+        <w:spacing w:after="0" w:line="285" w:lineRule="atLeast"/>
+        <w:rPr>
+          <w:rFonts w:ascii="Consolas" w:eastAsia="Times New Roman" w:hAnsi="Consolas" w:cs="Times New Roman"/>
+          <w:b/>
+          <w:color w:val="202020"/>
+          <w:sz w:val="21"/>
+          <w:szCs w:val="21"/>
+          <w:lang w:eastAsia="en-IN"/>
+        </w:rPr>
+      </w:pPr>
     </w:p>
     <w:p>
       <w:pPr>
@@ -52391,6 +52685,7 @@
       <w:r>
         <w:rPr>
           <w:rFonts w:ascii="Consolas" w:eastAsia="Times New Roman" w:hAnsi="Consolas" w:cs="Times New Roman"/>
+          <w:noProof/>
           <w:color w:val="202020"/>
           <w:sz w:val="21"/>
           <w:szCs w:val="21"/>
@@ -52420,7 +52715,7 @@
                     <pic:cNvPicPr/>
                   </pic:nvPicPr>
                   <pic:blipFill>
-                    <a:blip r:embed="rId111">
+                    <a:blip r:embed="rId114">
                       <a:extLst>
                         <a:ext uri="{28A0092B-C50C-407E-A947-70E740481C1C}">
                           <a14:useLocalDpi xmlns:a14="http://schemas.microsoft.com/office/drawing/2010/main" val="0"/>
@@ -52531,17 +52826,7 @@
           <w:lang w:val="en-US"/>
         </w:rPr>
         <w:lastRenderedPageBreak/>
-        <w:t>Web.xml</w:t>
-      </w:r>
-      <w:r>
-        <w:rPr>
-          <w:b/>
-          <w:bCs/>
-          <w:sz w:val="28"/>
-          <w:szCs w:val="28"/>
-          <w:lang w:val="en-US"/>
-        </w:rPr>
-        <w:t>:</w:t>
+        <w:t>Web.xml:</w:t>
       </w:r>
     </w:p>
     <w:p>
@@ -52560,6 +52845,7 @@
       <w:r>
         <w:rPr>
           <w:rFonts w:ascii="Consolas" w:eastAsia="Times New Roman" w:hAnsi="Consolas" w:cs="Times New Roman"/>
+          <w:noProof/>
           <w:color w:val="202020"/>
           <w:sz w:val="21"/>
           <w:szCs w:val="21"/>
@@ -52581,7 +52867,7 @@
                     <pic:cNvPicPr/>
                   </pic:nvPicPr>
                   <pic:blipFill>
-                    <a:blip r:embed="rId112"/>
+                    <a:blip r:embed="rId115"/>
                     <a:stretch>
                       <a:fillRect/>
                     </a:stretch>
@@ -52659,9 +52945,10 @@
         <w:rPr>
           <w:b/>
           <w:bCs/>
+          <w:noProof/>
           <w:sz w:val="28"/>
           <w:szCs w:val="28"/>
-          <w:lang w:val="en-US"/>
+          <w:lang w:eastAsia="en-IN"/>
         </w:rPr>
         <w:drawing>
           <wp:inline distT="0" distB="0" distL="0" distR="0" wp14:anchorId="7194B1AA" wp14:editId="7070B679">
@@ -52679,7 +52966,7 @@
                     <pic:cNvPicPr/>
                   </pic:nvPicPr>
                   <pic:blipFill>
-                    <a:blip r:embed="rId113"/>
+                    <a:blip r:embed="rId116"/>
                     <a:stretch>
                       <a:fillRect/>
                     </a:stretch>
@@ -52732,8 +53019,6 @@
           <w:lang w:eastAsia="en-IN"/>
         </w:rPr>
       </w:pPr>
-      <w:bookmarkStart w:id="0" w:name="_GoBack"/>
-      <w:bookmarkEnd w:id="0"/>
     </w:p>
     <w:p>
       <w:pPr>
@@ -52765,7 +53050,7 @@
     </w:p>
     <w:p>
       <w:pPr>
-        <w:spacing w:line="254" w:lineRule="auto"/>
+        <w:spacing w:line="256" w:lineRule="auto"/>
         <w:ind w:left="720"/>
         <w:jc w:val="both"/>
         <w:rPr>
@@ -52777,9 +53062,784 @@
         </w:rPr>
       </w:pPr>
     </w:p>
+    <w:p>
+      <w:pPr>
+        <w:spacing w:line="256" w:lineRule="auto"/>
+        <w:ind w:left="720"/>
+        <w:jc w:val="both"/>
+        <w:rPr>
+          <w:b/>
+          <w:bCs/>
+          <w:sz w:val="28"/>
+          <w:szCs w:val="28"/>
+          <w:lang w:val="en-US"/>
+        </w:rPr>
+      </w:pPr>
+    </w:p>
+    <w:p>
+      <w:pPr>
+        <w:spacing w:line="256" w:lineRule="auto"/>
+        <w:ind w:left="720"/>
+        <w:jc w:val="both"/>
+        <w:rPr>
+          <w:b/>
+          <w:bCs/>
+          <w:sz w:val="28"/>
+          <w:szCs w:val="28"/>
+          <w:lang w:val="en-US"/>
+        </w:rPr>
+      </w:pPr>
+    </w:p>
+    <w:p>
+      <w:pPr>
+        <w:spacing w:line="256" w:lineRule="auto"/>
+        <w:ind w:left="720"/>
+        <w:jc w:val="both"/>
+        <w:rPr>
+          <w:b/>
+          <w:bCs/>
+          <w:sz w:val="28"/>
+          <w:szCs w:val="28"/>
+          <w:lang w:val="en-US"/>
+        </w:rPr>
+      </w:pPr>
+    </w:p>
+    <w:p>
+      <w:pPr>
+        <w:pStyle w:val="ListParagraph"/>
+        <w:numPr>
+          <w:ilvl w:val="0"/>
+          <w:numId w:val="15"/>
+        </w:numPr>
+        <w:shd w:val="clear" w:color="auto" w:fill="FFFFFF"/>
+        <w:spacing w:after="0" w:line="285" w:lineRule="atLeast"/>
+        <w:rPr>
+          <w:rFonts w:ascii="Consolas" w:eastAsia="Times New Roman" w:hAnsi="Consolas" w:cs="Times New Roman"/>
+          <w:color w:val="202020"/>
+          <w:sz w:val="21"/>
+          <w:szCs w:val="21"/>
+          <w:lang w:eastAsia="en-IN"/>
+        </w:rPr>
+      </w:pPr>
+      <w:r>
+        <w:rPr>
+          <w:b/>
+          <w:bCs/>
+          <w:sz w:val="28"/>
+          <w:szCs w:val="28"/>
+          <w:lang w:val="en-US"/>
+        </w:rPr>
+        <w:lastRenderedPageBreak/>
+        <w:t xml:space="preserve">Aim: </w:t>
+      </w:r>
+      <w:r>
+        <w:rPr>
+          <w:sz w:val="28"/>
+          <w:szCs w:val="28"/>
+          <w:lang w:val="en-US"/>
+        </w:rPr>
+        <w:t xml:space="preserve">Demonstrate </w:t>
+      </w:r>
+      <w:proofErr w:type="spellStart"/>
+      <w:r>
+        <w:rPr>
+          <w:b/>
+          <w:sz w:val="28"/>
+          <w:szCs w:val="28"/>
+          <w:lang w:val="en-US"/>
+        </w:rPr>
+        <w:t>RequestDispatcher</w:t>
+      </w:r>
+      <w:proofErr w:type="spellEnd"/>
+      <w:r>
+        <w:rPr>
+          <w:b/>
+          <w:sz w:val="28"/>
+          <w:szCs w:val="28"/>
+          <w:lang w:val="en-US"/>
+        </w:rPr>
+        <w:t xml:space="preserve"> </w:t>
+      </w:r>
+      <w:r>
+        <w:rPr>
+          <w:sz w:val="28"/>
+          <w:szCs w:val="28"/>
+          <w:lang w:val="en-US"/>
+        </w:rPr>
+        <w:t xml:space="preserve">using </w:t>
+      </w:r>
+      <w:proofErr w:type="gramStart"/>
+      <w:r>
+        <w:rPr>
+          <w:sz w:val="28"/>
+          <w:szCs w:val="28"/>
+          <w:lang w:val="en-US"/>
+        </w:rPr>
+        <w:t>forward(</w:t>
+      </w:r>
+      <w:proofErr w:type="gramEnd"/>
+      <w:r>
+        <w:rPr>
+          <w:sz w:val="28"/>
+          <w:szCs w:val="28"/>
+          <w:lang w:val="en-US"/>
+        </w:rPr>
+        <w:t>) and include().</w:t>
+      </w:r>
+    </w:p>
+    <w:p>
+      <w:pPr>
+        <w:pStyle w:val="ListParagraph"/>
+        <w:shd w:val="clear" w:color="auto" w:fill="FFFFFF"/>
+        <w:spacing w:after="0" w:line="285" w:lineRule="atLeast"/>
+        <w:rPr>
+          <w:b/>
+          <w:bCs/>
+          <w:sz w:val="28"/>
+          <w:szCs w:val="28"/>
+          <w:lang w:val="en-US"/>
+        </w:rPr>
+      </w:pPr>
+    </w:p>
+    <w:p>
+      <w:pPr>
+        <w:pStyle w:val="ListParagraph"/>
+        <w:shd w:val="clear" w:color="auto" w:fill="FFFFFF"/>
+        <w:spacing w:after="0" w:line="285" w:lineRule="atLeast"/>
+        <w:rPr>
+          <w:rFonts w:ascii="Consolas" w:eastAsia="Times New Roman" w:hAnsi="Consolas" w:cs="Times New Roman"/>
+          <w:color w:val="202020"/>
+          <w:sz w:val="21"/>
+          <w:szCs w:val="21"/>
+          <w:lang w:eastAsia="en-IN"/>
+        </w:rPr>
+      </w:pPr>
+      <w:r>
+        <w:rPr>
+          <w:b/>
+          <w:bCs/>
+          <w:sz w:val="28"/>
+          <w:szCs w:val="28"/>
+          <w:lang w:val="en-US"/>
+        </w:rPr>
+        <w:t>Tomcat Configuration:</w:t>
+      </w:r>
+    </w:p>
+    <w:p>
+      <w:pPr>
+        <w:pStyle w:val="ListParagraph"/>
+        <w:shd w:val="clear" w:color="auto" w:fill="FFFFFF"/>
+        <w:spacing w:after="0" w:line="285" w:lineRule="atLeast"/>
+        <w:rPr>
+          <w:rFonts w:ascii="Consolas" w:eastAsia="Times New Roman" w:hAnsi="Consolas" w:cs="Times New Roman"/>
+          <w:color w:val="202020"/>
+          <w:sz w:val="21"/>
+          <w:szCs w:val="21"/>
+          <w:lang w:eastAsia="en-IN"/>
+        </w:rPr>
+      </w:pPr>
+      <w:r>
+        <w:rPr>
+          <w:rFonts w:ascii="Consolas" w:eastAsia="Times New Roman" w:hAnsi="Consolas" w:cs="Times New Roman"/>
+          <w:color w:val="202020"/>
+          <w:sz w:val="21"/>
+          <w:szCs w:val="21"/>
+          <w:lang w:eastAsia="en-IN"/>
+        </w:rPr>
+        <w:drawing>
+          <wp:inline distT="0" distB="0" distL="0" distR="0" wp14:anchorId="51BAD6C3" wp14:editId="7F720D55">
+            <wp:extent cx="5943600" cy="3933190"/>
+            <wp:effectExtent l="0" t="0" r="0" b="0"/>
+            <wp:docPr id="453" name="Picture 453"/>
+            <wp:cNvGraphicFramePr>
+              <a:graphicFrameLocks xmlns:a="http://schemas.openxmlformats.org/drawingml/2006/main" noChangeAspect="1"/>
+            </wp:cNvGraphicFramePr>
+            <a:graphic xmlns:a="http://schemas.openxmlformats.org/drawingml/2006/main">
+              <a:graphicData uri="http://schemas.openxmlformats.org/drawingml/2006/picture">
+                <pic:pic xmlns:pic="http://schemas.openxmlformats.org/drawingml/2006/picture">
+                  <pic:nvPicPr>
+                    <pic:cNvPr id="0" name=""/>
+                    <pic:cNvPicPr/>
+                  </pic:nvPicPr>
+                  <pic:blipFill>
+                    <a:blip r:embed="rId117"/>
+                    <a:stretch>
+                      <a:fillRect/>
+                    </a:stretch>
+                  </pic:blipFill>
+                  <pic:spPr>
+                    <a:xfrm>
+                      <a:off x="0" y="0"/>
+                      <a:ext cx="5943600" cy="3933190"/>
+                    </a:xfrm>
+                    <a:prstGeom prst="rect">
+                      <a:avLst/>
+                    </a:prstGeom>
+                  </pic:spPr>
+                </pic:pic>
+              </a:graphicData>
+            </a:graphic>
+          </wp:inline>
+        </w:drawing>
+      </w:r>
+    </w:p>
+    <w:p>
+      <w:pPr>
+        <w:spacing w:line="256" w:lineRule="auto"/>
+        <w:ind w:left="720"/>
+        <w:jc w:val="both"/>
+        <w:rPr>
+          <w:b/>
+          <w:bCs/>
+          <w:sz w:val="28"/>
+          <w:szCs w:val="28"/>
+          <w:lang w:val="en-US"/>
+        </w:rPr>
+      </w:pPr>
+    </w:p>
+    <w:p>
+      <w:pPr>
+        <w:spacing w:line="256" w:lineRule="auto"/>
+        <w:ind w:left="720"/>
+        <w:jc w:val="both"/>
+        <w:rPr>
+          <w:b/>
+          <w:bCs/>
+          <w:sz w:val="28"/>
+          <w:szCs w:val="28"/>
+          <w:lang w:val="en-US"/>
+        </w:rPr>
+      </w:pPr>
+      <w:r>
+        <w:rPr>
+          <w:b/>
+          <w:bCs/>
+          <w:sz w:val="28"/>
+          <w:szCs w:val="28"/>
+          <w:lang w:val="en-US"/>
+        </w:rPr>
+        <w:t>FirstServlet.java:</w:t>
+      </w:r>
+    </w:p>
+    <w:p>
+      <w:pPr>
+        <w:spacing w:line="256" w:lineRule="auto"/>
+        <w:ind w:left="720"/>
+        <w:jc w:val="both"/>
+        <w:rPr>
+          <w:bCs/>
+          <w:sz w:val="28"/>
+          <w:szCs w:val="28"/>
+          <w:lang w:val="en-US"/>
+        </w:rPr>
+      </w:pPr>
+      <w:r>
+        <w:rPr>
+          <w:bCs/>
+          <w:sz w:val="28"/>
+          <w:szCs w:val="28"/>
+          <w:lang w:val="en-US"/>
+        </w:rPr>
+        <w:drawing>
+          <wp:inline distT="0" distB="0" distL="0" distR="0" wp14:anchorId="5E42A226" wp14:editId="43A2FA49">
+            <wp:extent cx="3915508" cy="3760196"/>
+            <wp:effectExtent l="0" t="0" r="8890" b="0"/>
+            <wp:docPr id="456" name="Picture 456"/>
+            <wp:cNvGraphicFramePr>
+              <a:graphicFrameLocks xmlns:a="http://schemas.openxmlformats.org/drawingml/2006/main" noChangeAspect="1"/>
+            </wp:cNvGraphicFramePr>
+            <a:graphic xmlns:a="http://schemas.openxmlformats.org/drawingml/2006/main">
+              <a:graphicData uri="http://schemas.openxmlformats.org/drawingml/2006/picture">
+                <pic:pic xmlns:pic="http://schemas.openxmlformats.org/drawingml/2006/picture">
+                  <pic:nvPicPr>
+                    <pic:cNvPr id="0" name=""/>
+                    <pic:cNvPicPr/>
+                  </pic:nvPicPr>
+                  <pic:blipFill>
+                    <a:blip r:embed="rId118"/>
+                    <a:stretch>
+                      <a:fillRect/>
+                    </a:stretch>
+                  </pic:blipFill>
+                  <pic:spPr>
+                    <a:xfrm>
+                      <a:off x="0" y="0"/>
+                      <a:ext cx="3919305" cy="3763843"/>
+                    </a:xfrm>
+                    <a:prstGeom prst="rect">
+                      <a:avLst/>
+                    </a:prstGeom>
+                  </pic:spPr>
+                </pic:pic>
+              </a:graphicData>
+            </a:graphic>
+          </wp:inline>
+        </w:drawing>
+      </w:r>
+    </w:p>
+    <w:p>
+      <w:pPr>
+        <w:spacing w:line="254" w:lineRule="auto"/>
+        <w:ind w:left="720"/>
+        <w:jc w:val="both"/>
+        <w:rPr>
+          <w:b/>
+          <w:bCs/>
+          <w:sz w:val="28"/>
+          <w:szCs w:val="28"/>
+          <w:lang w:val="en-US"/>
+        </w:rPr>
+      </w:pPr>
+      <w:r>
+        <w:rPr>
+          <w:b/>
+          <w:bCs/>
+          <w:sz w:val="28"/>
+          <w:szCs w:val="28"/>
+          <w:lang w:val="en-US"/>
+        </w:rPr>
+        <w:lastRenderedPageBreak/>
+        <w:t>ForwardServlet.java:</w:t>
+      </w:r>
+    </w:p>
+    <w:p>
+      <w:pPr>
+        <w:spacing w:line="254" w:lineRule="auto"/>
+        <w:ind w:left="720"/>
+        <w:jc w:val="both"/>
+        <w:rPr>
+          <w:b/>
+          <w:bCs/>
+          <w:sz w:val="28"/>
+          <w:szCs w:val="28"/>
+          <w:lang w:val="en-US"/>
+        </w:rPr>
+      </w:pPr>
+      <w:r>
+        <w:rPr>
+          <w:b/>
+          <w:bCs/>
+          <w:sz w:val="28"/>
+          <w:szCs w:val="28"/>
+          <w:lang w:val="en-US"/>
+        </w:rPr>
+        <w:drawing>
+          <wp:inline distT="0" distB="0" distL="0" distR="0" wp14:anchorId="13060173" wp14:editId="071D262C">
+            <wp:extent cx="5058481" cy="3648584"/>
+            <wp:effectExtent l="0" t="0" r="8890" b="9525"/>
+            <wp:docPr id="458" name="Picture 458"/>
+            <wp:cNvGraphicFramePr>
+              <a:graphicFrameLocks xmlns:a="http://schemas.openxmlformats.org/drawingml/2006/main" noChangeAspect="1"/>
+            </wp:cNvGraphicFramePr>
+            <a:graphic xmlns:a="http://schemas.openxmlformats.org/drawingml/2006/main">
+              <a:graphicData uri="http://schemas.openxmlformats.org/drawingml/2006/picture">
+                <pic:pic xmlns:pic="http://schemas.openxmlformats.org/drawingml/2006/picture">
+                  <pic:nvPicPr>
+                    <pic:cNvPr id="0" name=""/>
+                    <pic:cNvPicPr/>
+                  </pic:nvPicPr>
+                  <pic:blipFill>
+                    <a:blip r:embed="rId119"/>
+                    <a:stretch>
+                      <a:fillRect/>
+                    </a:stretch>
+                  </pic:blipFill>
+                  <pic:spPr>
+                    <a:xfrm>
+                      <a:off x="0" y="0"/>
+                      <a:ext cx="5058481" cy="3648584"/>
+                    </a:xfrm>
+                    <a:prstGeom prst="rect">
+                      <a:avLst/>
+                    </a:prstGeom>
+                  </pic:spPr>
+                </pic:pic>
+              </a:graphicData>
+            </a:graphic>
+          </wp:inline>
+        </w:drawing>
+      </w:r>
+    </w:p>
+    <w:p>
+      <w:pPr>
+        <w:spacing w:line="254" w:lineRule="auto"/>
+        <w:ind w:left="720"/>
+        <w:jc w:val="both"/>
+        <w:rPr>
+          <w:b/>
+          <w:bCs/>
+          <w:sz w:val="28"/>
+          <w:szCs w:val="28"/>
+          <w:lang w:val="en-US"/>
+        </w:rPr>
+      </w:pPr>
+      <w:r>
+        <w:rPr>
+          <w:b/>
+          <w:bCs/>
+          <w:sz w:val="28"/>
+          <w:szCs w:val="28"/>
+          <w:lang w:val="en-US"/>
+        </w:rPr>
+        <w:t>IncludeServlet.java:</w:t>
+      </w:r>
+    </w:p>
+    <w:p>
+      <w:pPr>
+        <w:spacing w:line="254" w:lineRule="auto"/>
+        <w:ind w:left="720"/>
+        <w:jc w:val="both"/>
+        <w:rPr>
+          <w:b/>
+          <w:bCs/>
+          <w:sz w:val="28"/>
+          <w:szCs w:val="28"/>
+          <w:lang w:val="en-US"/>
+        </w:rPr>
+      </w:pPr>
+      <w:r>
+        <w:rPr>
+          <w:b/>
+          <w:bCs/>
+          <w:sz w:val="28"/>
+          <w:szCs w:val="28"/>
+          <w:lang w:val="en-US"/>
+        </w:rPr>
+        <w:drawing>
+          <wp:inline distT="0" distB="0" distL="0" distR="0" wp14:anchorId="7EFF4B53" wp14:editId="60EB5AAB">
+            <wp:extent cx="4443046" cy="4094246"/>
+            <wp:effectExtent l="0" t="0" r="0" b="1905"/>
+            <wp:docPr id="459" name="Picture 459"/>
+            <wp:cNvGraphicFramePr>
+              <a:graphicFrameLocks xmlns:a="http://schemas.openxmlformats.org/drawingml/2006/main" noChangeAspect="1"/>
+            </wp:cNvGraphicFramePr>
+            <a:graphic xmlns:a="http://schemas.openxmlformats.org/drawingml/2006/main">
+              <a:graphicData uri="http://schemas.openxmlformats.org/drawingml/2006/picture">
+                <pic:pic xmlns:pic="http://schemas.openxmlformats.org/drawingml/2006/picture">
+                  <pic:nvPicPr>
+                    <pic:cNvPr id="0" name=""/>
+                    <pic:cNvPicPr/>
+                  </pic:nvPicPr>
+                  <pic:blipFill>
+                    <a:blip r:embed="rId120"/>
+                    <a:stretch>
+                      <a:fillRect/>
+                    </a:stretch>
+                  </pic:blipFill>
+                  <pic:spPr>
+                    <a:xfrm>
+                      <a:off x="0" y="0"/>
+                      <a:ext cx="4450329" cy="4100958"/>
+                    </a:xfrm>
+                    <a:prstGeom prst="rect">
+                      <a:avLst/>
+                    </a:prstGeom>
+                  </pic:spPr>
+                </pic:pic>
+              </a:graphicData>
+            </a:graphic>
+          </wp:inline>
+        </w:drawing>
+      </w:r>
+    </w:p>
+    <w:p>
+      <w:pPr>
+        <w:spacing w:line="254" w:lineRule="auto"/>
+        <w:ind w:left="720"/>
+        <w:jc w:val="both"/>
+        <w:rPr>
+          <w:b/>
+          <w:bCs/>
+          <w:sz w:val="28"/>
+          <w:szCs w:val="28"/>
+          <w:lang w:val="en-US"/>
+        </w:rPr>
+      </w:pPr>
+    </w:p>
+    <w:p>
+      <w:pPr>
+        <w:spacing w:line="254" w:lineRule="auto"/>
+        <w:ind w:left="720"/>
+        <w:jc w:val="both"/>
+        <w:rPr>
+          <w:b/>
+          <w:bCs/>
+          <w:sz w:val="28"/>
+          <w:szCs w:val="28"/>
+          <w:lang w:val="en-US"/>
+        </w:rPr>
+      </w:pPr>
+      <w:r>
+        <w:rPr>
+          <w:b/>
+          <w:bCs/>
+          <w:sz w:val="28"/>
+          <w:szCs w:val="28"/>
+          <w:lang w:val="en-US"/>
+        </w:rPr>
+        <w:lastRenderedPageBreak/>
+        <w:t>OUTPUT:</w:t>
+      </w:r>
+    </w:p>
+    <w:p>
+      <w:pPr>
+        <w:spacing w:line="254" w:lineRule="auto"/>
+        <w:ind w:left="720"/>
+        <w:jc w:val="both"/>
+        <w:rPr>
+          <w:b/>
+          <w:bCs/>
+          <w:sz w:val="28"/>
+          <w:szCs w:val="28"/>
+          <w:lang w:val="en-US"/>
+        </w:rPr>
+      </w:pPr>
+      <w:r>
+        <w:rPr>
+          <w:b/>
+          <w:bCs/>
+          <w:sz w:val="28"/>
+          <w:szCs w:val="28"/>
+          <w:lang w:val="en-US"/>
+        </w:rPr>
+        <w:t>http://localhost:8080/Delta/first</w:t>
+      </w:r>
+    </w:p>
+    <w:p>
+      <w:pPr>
+        <w:spacing w:line="254" w:lineRule="auto"/>
+        <w:ind w:left="720"/>
+        <w:jc w:val="both"/>
+        <w:rPr>
+          <w:b/>
+          <w:bCs/>
+          <w:sz w:val="28"/>
+          <w:szCs w:val="28"/>
+          <w:lang w:val="en-US"/>
+        </w:rPr>
+      </w:pPr>
+      <w:r>
+        <w:rPr>
+          <w:b/>
+          <w:bCs/>
+          <w:sz w:val="28"/>
+          <w:szCs w:val="28"/>
+          <w:lang w:val="en-US"/>
+        </w:rPr>
+        <w:drawing>
+          <wp:inline distT="0" distB="0" distL="0" distR="0" wp14:anchorId="767C85CC" wp14:editId="2337DE42">
+            <wp:extent cx="2972215" cy="1305107"/>
+            <wp:effectExtent l="19050" t="19050" r="19050" b="28575"/>
+            <wp:docPr id="460" name="Picture 460"/>
+            <wp:cNvGraphicFramePr>
+              <a:graphicFrameLocks xmlns:a="http://schemas.openxmlformats.org/drawingml/2006/main" noChangeAspect="1"/>
+            </wp:cNvGraphicFramePr>
+            <a:graphic xmlns:a="http://schemas.openxmlformats.org/drawingml/2006/main">
+              <a:graphicData uri="http://schemas.openxmlformats.org/drawingml/2006/picture">
+                <pic:pic xmlns:pic="http://schemas.openxmlformats.org/drawingml/2006/picture">
+                  <pic:nvPicPr>
+                    <pic:cNvPr id="0" name=""/>
+                    <pic:cNvPicPr/>
+                  </pic:nvPicPr>
+                  <pic:blipFill>
+                    <a:blip r:embed="rId121"/>
+                    <a:stretch>
+                      <a:fillRect/>
+                    </a:stretch>
+                  </pic:blipFill>
+                  <pic:spPr>
+                    <a:xfrm>
+                      <a:off x="0" y="0"/>
+                      <a:ext cx="2972215" cy="1305107"/>
+                    </a:xfrm>
+                    <a:prstGeom prst="rect">
+                      <a:avLst/>
+                    </a:prstGeom>
+                    <a:ln>
+                      <a:solidFill>
+                        <a:schemeClr val="tx1"/>
+                      </a:solidFill>
+                    </a:ln>
+                  </pic:spPr>
+                </pic:pic>
+              </a:graphicData>
+            </a:graphic>
+          </wp:inline>
+        </w:drawing>
+      </w:r>
+    </w:p>
+    <w:p>
+      <w:pPr>
+        <w:spacing w:line="254" w:lineRule="auto"/>
+        <w:ind w:left="720"/>
+        <w:jc w:val="both"/>
+        <w:rPr>
+          <w:b/>
+          <w:bCs/>
+          <w:sz w:val="28"/>
+          <w:szCs w:val="28"/>
+          <w:lang w:val="en-US"/>
+        </w:rPr>
+      </w:pPr>
+      <w:r>
+        <w:rPr>
+          <w:b/>
+          <w:bCs/>
+          <w:sz w:val="28"/>
+          <w:szCs w:val="28"/>
+          <w:lang w:val="en-US"/>
+        </w:rPr>
+        <w:t>http://localhost:8080/Delta/forward</w:t>
+      </w:r>
+    </w:p>
+    <w:p>
+      <w:pPr>
+        <w:spacing w:line="254" w:lineRule="auto"/>
+        <w:ind w:left="720"/>
+        <w:jc w:val="both"/>
+        <w:rPr>
+          <w:b/>
+          <w:bCs/>
+          <w:sz w:val="28"/>
+          <w:szCs w:val="28"/>
+          <w:lang w:val="en-US"/>
+        </w:rPr>
+      </w:pPr>
+      <w:r>
+        <w:rPr>
+          <w:b/>
+          <w:bCs/>
+          <w:sz w:val="28"/>
+          <w:szCs w:val="28"/>
+          <w:lang w:val="en-US"/>
+        </w:rPr>
+        <w:drawing>
+          <wp:inline distT="0" distB="0" distL="0" distR="0" wp14:anchorId="20610A57" wp14:editId="4DE1E517">
+            <wp:extent cx="2591162" cy="752580"/>
+            <wp:effectExtent l="0" t="0" r="0" b="9525"/>
+            <wp:docPr id="461" name="Picture 461"/>
+            <wp:cNvGraphicFramePr>
+              <a:graphicFrameLocks xmlns:a="http://schemas.openxmlformats.org/drawingml/2006/main" noChangeAspect="1"/>
+            </wp:cNvGraphicFramePr>
+            <a:graphic xmlns:a="http://schemas.openxmlformats.org/drawingml/2006/main">
+              <a:graphicData uri="http://schemas.openxmlformats.org/drawingml/2006/picture">
+                <pic:pic xmlns:pic="http://schemas.openxmlformats.org/drawingml/2006/picture">
+                  <pic:nvPicPr>
+                    <pic:cNvPr id="0" name=""/>
+                    <pic:cNvPicPr/>
+                  </pic:nvPicPr>
+                  <pic:blipFill>
+                    <a:blip r:embed="rId122"/>
+                    <a:stretch>
+                      <a:fillRect/>
+                    </a:stretch>
+                  </pic:blipFill>
+                  <pic:spPr>
+                    <a:xfrm>
+                      <a:off x="0" y="0"/>
+                      <a:ext cx="2591162" cy="752580"/>
+                    </a:xfrm>
+                    <a:prstGeom prst="rect">
+                      <a:avLst/>
+                    </a:prstGeom>
+                  </pic:spPr>
+                </pic:pic>
+              </a:graphicData>
+            </a:graphic>
+          </wp:inline>
+        </w:drawing>
+      </w:r>
+    </w:p>
+    <w:p>
+      <w:pPr>
+        <w:spacing w:line="254" w:lineRule="auto"/>
+        <w:ind w:left="720"/>
+        <w:jc w:val="both"/>
+        <w:rPr>
+          <w:b/>
+          <w:bCs/>
+          <w:sz w:val="28"/>
+          <w:szCs w:val="28"/>
+          <w:lang w:val="en-US"/>
+        </w:rPr>
+      </w:pPr>
+      <w:r>
+        <w:rPr>
+          <w:b/>
+          <w:bCs/>
+          <w:sz w:val="28"/>
+          <w:szCs w:val="28"/>
+          <w:lang w:val="en-US"/>
+        </w:rPr>
+        <w:t>http://localhost:8080/Delta/include</w:t>
+      </w:r>
+    </w:p>
+    <w:p>
+      <w:pPr>
+        <w:spacing w:line="254" w:lineRule="auto"/>
+        <w:ind w:left="720"/>
+        <w:jc w:val="both"/>
+        <w:rPr>
+          <w:b/>
+          <w:bCs/>
+          <w:sz w:val="28"/>
+          <w:szCs w:val="28"/>
+          <w:lang w:val="en-US"/>
+        </w:rPr>
+      </w:pPr>
+      <w:r>
+        <w:rPr>
+          <w:b/>
+          <w:bCs/>
+          <w:sz w:val="28"/>
+          <w:szCs w:val="28"/>
+          <w:lang w:val="en-US"/>
+        </w:rPr>
+        <w:drawing>
+          <wp:inline distT="0" distB="0" distL="0" distR="0" wp14:anchorId="78D2C747" wp14:editId="4933EBFF">
+            <wp:extent cx="2801816" cy="2055877"/>
+            <wp:effectExtent l="19050" t="19050" r="17780" b="20955"/>
+            <wp:docPr id="462" name="Picture 462"/>
+            <wp:cNvGraphicFramePr>
+              <a:graphicFrameLocks xmlns:a="http://schemas.openxmlformats.org/drawingml/2006/main" noChangeAspect="1"/>
+            </wp:cNvGraphicFramePr>
+            <a:graphic xmlns:a="http://schemas.openxmlformats.org/drawingml/2006/main">
+              <a:graphicData uri="http://schemas.openxmlformats.org/drawingml/2006/picture">
+                <pic:pic xmlns:pic="http://schemas.openxmlformats.org/drawingml/2006/picture">
+                  <pic:nvPicPr>
+                    <pic:cNvPr id="0" name=""/>
+                    <pic:cNvPicPr/>
+                  </pic:nvPicPr>
+                  <pic:blipFill>
+                    <a:blip r:embed="rId123"/>
+                    <a:stretch>
+                      <a:fillRect/>
+                    </a:stretch>
+                  </pic:blipFill>
+                  <pic:spPr>
+                    <a:xfrm>
+                      <a:off x="0" y="0"/>
+                      <a:ext cx="2827311" cy="2074584"/>
+                    </a:xfrm>
+                    <a:prstGeom prst="rect">
+                      <a:avLst/>
+                    </a:prstGeom>
+                    <a:ln>
+                      <a:solidFill>
+                        <a:schemeClr val="tx1"/>
+                      </a:solidFill>
+                    </a:ln>
+                  </pic:spPr>
+                </pic:pic>
+              </a:graphicData>
+            </a:graphic>
+          </wp:inline>
+        </w:drawing>
+      </w:r>
+    </w:p>
     <w:sectPr>
-      <w:headerReference w:type="default" r:id="rId114"/>
-      <w:footerReference w:type="default" r:id="rId115"/>
+      <w:headerReference w:type="default" r:id="rId124"/>
+      <w:footerReference w:type="default" r:id="rId125"/>
       <w:pgSz w:w="11906" w:h="16838"/>
       <w:pgMar w:top="720" w:right="720" w:bottom="720" w:left="720" w:header="708" w:footer="708" w:gutter="0"/>
       <w:cols w:space="708"/>
@@ -52909,7 +53969,7 @@
             </wp:anchor>
           </w:drawing>
         </mc:Choice>
-        <mc:Fallback xmlns:wpsCustomData="http://www.wps.cn/officeDocument/2013/wpsCustomData" xmlns:w15="http://schemas.microsoft.com/office/word/2012/wordml">
+        <mc:Fallback xmlns:w15="http://schemas.microsoft.com/office/word/2012/wordml" xmlns:wpsCustomData="http://www.wps.cn/officeDocument/2013/wpsCustomData">
           <w:pict>
             <v:rect id="_x0000_s1026" o:spid="_x0000_s1026" o:spt="1" style="position:absolute;left:0pt;height:750.3pt;width:579.9pt;mso-position-horizontal:center;mso-position-horizontal-relative:page;mso-position-vertical:center;mso-position-vertical-relative:page;z-index:251660288;v-text-anchor:middle;mso-width-relative:page;mso-height-relative:page;mso-width-percent:950;mso-height-percent:950;" filled="f" stroked="t" coordsize="21600,21600" o:gfxdata="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">
               <v:fill on="f" focussize="0,0"/>
@@ -54343,7 +55403,7 @@
   <w:style w:type="paragraph" w:default="1" w:styleId="Normal">
     <w:name w:val="Normal"/>
     <w:qFormat/>
-    <w:rsid w:val="001203F0"/>
+    <w:rsid w:val="000B154F"/>
     <w:pPr>
       <w:spacing w:after="160" w:line="259" w:lineRule="auto"/>
     </w:pPr>
@@ -54644,7 +55704,7 @@
   <w:style w:type="paragraph" w:default="1" w:styleId="Normal">
     <w:name w:val="Normal"/>
     <w:qFormat/>
-    <w:rsid w:val="001203F0"/>
+    <w:rsid w:val="000B154F"/>
     <w:pPr>
       <w:spacing w:after="160" w:line="259" w:lineRule="auto"/>
     </w:pPr>

</xml_diff>